<commit_message>
discovery-questionnaire: letterhead contact block right edge 8.0in, fax 626-323-8181
Co-Authored-By: Claude Opus 5.5 <noreply@anthropic.com>
</commit_message>
<xml_diff>
--- a/discovery-questionnaire/assets/letterhead.docx
+++ b/discovery-questionnaire/assets/letterhead.docx
@@ -93,7 +93,7 @@
             <wp:anchor distT="0" distB="0" distL="114300" distR="114300" simplePos="0" relativeHeight="251662336" behindDoc="0" locked="0" layoutInCell="1" hidden="0" allowOverlap="1" wp14:anchorId="6773763B" wp14:editId="19017CDD">
               <wp:simplePos x="0" y="0"/>
               <wp:positionH relativeFrom="column">
-                <wp:posOffset>3713584</wp:posOffset>
+                <wp:posOffset>3276600</wp:posOffset>
               </wp:positionH>
               <wp:positionV relativeFrom="paragraph">
                 <wp:posOffset>-9331</wp:posOffset>
@@ -252,7 +252,7 @@
                               <w:sz w:val="20"/>
                               <w:szCs w:val="20"/>
                             </w:rPr>
-                            <w:t>626-240-2046</w:t>
+                            <w:t>626-323-8181</w:t>
                           </w:r>
                           <w:r>
                             <w:rPr>
@@ -298,7 +298,7 @@
         </mc:Choice>
         <mc:Fallback>
           <w:pict>
-            <v:rect w14:anchorId="6773763B" id="Rectangle 487657697" o:spid="_x0000_s1026" style="position:absolute;margin-left:292.4pt;margin-top:-.75pt;width:246pt;height:85.2pt;z-index:251662336;visibility:visible;mso-wrap-style:square;mso-height-percent:0;mso-wrap-distance-left:9pt;mso-wrap-distance-top:0;mso-wrap-distance-right:9pt;mso-wrap-distance-bottom:0;mso-position-horizontal:absolute;mso-position-horizontal-relative:text;mso-position-vertical:absolute;mso-position-vertical-relative:text;mso-height-percent:0;mso-height-relative:margin;v-text-anchor:top" o:gfxdata="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" filled="f" stroked="f">
+            <v:rect w14:anchorId="6773763B" id="Rectangle 487657697" o:spid="_x0000_s1026" style="position:absolute;margin-left:258pt;margin-top:-.75pt;width:246pt;height:85.2pt;z-index:251662336;visibility:visible;mso-wrap-style:square;mso-height-percent:0;mso-wrap-distance-left:9pt;mso-wrap-distance-top:0;mso-wrap-distance-right:9pt;mso-wrap-distance-bottom:0;mso-position-horizontal:absolute;mso-position-horizontal-relative:text;mso-position-vertical:absolute;mso-position-vertical-relative:text;mso-height-percent:0;mso-height-relative:margin;v-text-anchor:top" o:gfxdata="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" filled="f" stroked="f">
               <v:textbox inset="2.53958mm,1.2694mm,2.53958mm,1.2694mm">
                 <w:txbxContent>
                   <w:p>
@@ -431,7 +431,7 @@
                         <w:sz w:val="20"/>
                         <w:szCs w:val="20"/>
                       </w:rPr>
-                      <w:t>626-240-2046</w:t>
+                      <w:t>626-323-8181</w:t>
                     </w:r>
                     <w:r>
                       <w:rPr>

</xml_diff>